<commit_message>
TS 5 and SJ Corrections
</commit_message>
<xml_diff>
--- a/TS-Padam/TS-5.4/TS 5.4 Tamil Pada Paatam Corrections.docx
+++ b/TS-Padam/TS-5.4/TS 5.4 Tamil Pada Paatam Corrections.docx
@@ -19,9 +19,8 @@
           <w:szCs w:val="32"/>
           <w:u w:val="single"/>
         </w:rPr>
-        <w:t xml:space="preserve">TS Pada </w:t>
+        <w:t xml:space="preserve">TS Pada Paatam – TS 5.4 </w:t>
       </w:r>
-      <w:proofErr w:type="spellStart"/>
       <w:r>
         <w:rPr>
           <w:b/>
@@ -30,7 +29,30 @@
           <w:szCs w:val="32"/>
           <w:u w:val="single"/>
         </w:rPr>
-        <w:t>Paatam</w:t>
+        <w:t>Tamil</w:t>
+      </w:r>
+      <w:r>
+        <w:rPr>
+          <w:b/>
+          <w:bCs/>
+          <w:sz w:val="32"/>
+          <w:szCs w:val="32"/>
+          <w:u w:val="single"/>
+        </w:rPr>
+        <w:t xml:space="preserve"> corrections – Observed till </w:t>
+      </w:r>
+      <w:proofErr w:type="spellStart"/>
+      <w:r>
+        <w:rPr>
+          <w:b/>
+          <w:bCs/>
+          <w:color w:val="EE0000"/>
+          <w:sz w:val="32"/>
+          <w:szCs w:val="32"/>
+          <w:highlight w:val="yellow"/>
+          <w:u w:val="single"/>
+        </w:rPr>
+        <w:t>xxxxxxxxxxx</w:t>
       </w:r>
       <w:proofErr w:type="spellEnd"/>
       <w:r>
@@ -41,7 +63,976 @@
           <w:szCs w:val="32"/>
           <w:u w:val="single"/>
         </w:rPr>
-        <w:t xml:space="preserve"> – TS 5.4 </w:t>
+        <w:br/>
+      </w:r>
+      <w:r>
+        <w:rPr>
+          <w:b/>
+          <w:bCs/>
+        </w:rPr>
+        <w:t xml:space="preserve"> (ignore those which are already incorporated in your book’s version and date)</w:t>
+      </w:r>
+    </w:p>
+    <w:tbl>
+      <w:tblPr>
+        <w:tblW w:w="15026" w:type="dxa"/>
+        <w:tblInd w:w="-856" w:type="dxa"/>
+        <w:tblBorders>
+          <w:top w:val="single" w:sz="4" w:space="0" w:color="000000"/>
+          <w:left w:val="single" w:sz="4" w:space="0" w:color="000000"/>
+          <w:bottom w:val="single" w:sz="4" w:space="0" w:color="000000"/>
+          <w:right w:val="single" w:sz="4" w:space="0" w:color="000000"/>
+          <w:insideH w:val="single" w:sz="4" w:space="0" w:color="000000"/>
+          <w:insideV w:val="single" w:sz="4" w:space="0" w:color="000000"/>
+        </w:tblBorders>
+        <w:tblLook w:val="04A0" w:firstRow="1" w:lastRow="0" w:firstColumn="1" w:lastColumn="0" w:noHBand="0" w:noVBand="1"/>
+      </w:tblPr>
+      <w:tblGrid>
+        <w:gridCol w:w="3198"/>
+        <w:gridCol w:w="5608"/>
+        <w:gridCol w:w="6220"/>
+      </w:tblGrid>
+      <w:tr>
+        <w:tc>
+          <w:tcPr>
+            <w:tcW w:w="3198" w:type="dxa"/>
+          </w:tcPr>
+          <w:p>
+            <w:pPr>
+              <w:spacing w:before="0" w:line="240" w:lineRule="auto"/>
+              <w:jc w:val="center"/>
+              <w:rPr>
+                <w:b/>
+                <w:bCs/>
+                <w:sz w:val="32"/>
+                <w:szCs w:val="32"/>
+              </w:rPr>
+            </w:pPr>
+            <w:r>
+              <w:rPr>
+                <w:b/>
+                <w:bCs/>
+                <w:sz w:val="32"/>
+                <w:szCs w:val="32"/>
+              </w:rPr>
+              <w:t>Section, Paragraph</w:t>
+            </w:r>
+          </w:p>
+          <w:p>
+            <w:pPr>
+              <w:spacing w:before="0" w:line="240" w:lineRule="auto"/>
+              <w:jc w:val="center"/>
+              <w:rPr>
+                <w:b/>
+                <w:bCs/>
+                <w:sz w:val="32"/>
+                <w:szCs w:val="32"/>
+              </w:rPr>
+            </w:pPr>
+            <w:r>
+              <w:rPr>
+                <w:b/>
+                <w:bCs/>
+                <w:sz w:val="32"/>
+                <w:szCs w:val="32"/>
+              </w:rPr>
+              <w:t>Reference</w:t>
+            </w:r>
+          </w:p>
+        </w:tc>
+        <w:tc>
+          <w:tcPr>
+            <w:tcW w:w="5608" w:type="dxa"/>
+          </w:tcPr>
+          <w:p>
+            <w:pPr>
+              <w:spacing w:before="0" w:line="240" w:lineRule="auto"/>
+              <w:jc w:val="center"/>
+              <w:rPr>
+                <w:b/>
+                <w:bCs/>
+                <w:sz w:val="32"/>
+                <w:szCs w:val="32"/>
+              </w:rPr>
+            </w:pPr>
+            <w:r>
+              <w:rPr>
+                <w:b/>
+                <w:bCs/>
+                <w:sz w:val="32"/>
+                <w:szCs w:val="32"/>
+              </w:rPr>
+              <w:t>As Printed</w:t>
+            </w:r>
+          </w:p>
+        </w:tc>
+        <w:tc>
+          <w:tcPr>
+            <w:tcW w:w="6220" w:type="dxa"/>
+          </w:tcPr>
+          <w:p>
+            <w:pPr>
+              <w:spacing w:before="0" w:line="240" w:lineRule="auto"/>
+              <w:ind w:right="-18"/>
+              <w:jc w:val="center"/>
+              <w:rPr>
+                <w:b/>
+                <w:bCs/>
+                <w:sz w:val="32"/>
+                <w:szCs w:val="32"/>
+              </w:rPr>
+            </w:pPr>
+            <w:r>
+              <w:rPr>
+                <w:b/>
+                <w:bCs/>
+                <w:sz w:val="32"/>
+                <w:szCs w:val="32"/>
+              </w:rPr>
+              <w:t>To be read as or corrected as</w:t>
+            </w:r>
+          </w:p>
+        </w:tc>
+      </w:tr>
+      <w:tr>
+        <w:trPr>
+          <w:trHeight w:val="1274"/>
+        </w:trPr>
+        <w:tc>
+          <w:tcPr>
+            <w:tcW w:w="3198" w:type="dxa"/>
+            <w:tcBorders>
+              <w:top w:val="single" w:sz="4" w:space="0" w:color="000000"/>
+              <w:left w:val="single" w:sz="4" w:space="0" w:color="000000"/>
+              <w:bottom w:val="single" w:sz="4" w:space="0" w:color="000000"/>
+              <w:right w:val="single" w:sz="4" w:space="0" w:color="000000"/>
+            </w:tcBorders>
+          </w:tcPr>
+          <w:p>
+            <w:pPr>
+              <w:spacing w:before="0" w:line="240" w:lineRule="auto"/>
+              <w:rPr>
+                <w:rFonts w:cs="Latha"/>
+                <w:b/>
+                <w:sz w:val="28"/>
+                <w:szCs w:val="28"/>
+                <w:lang w:val="it-IT" w:bidi="ta-IN"/>
+              </w:rPr>
+            </w:pPr>
+            <w:r>
+              <w:rPr>
+                <w:rFonts w:cs="Latha"/>
+                <w:b/>
+                <w:sz w:val="28"/>
+                <w:szCs w:val="28"/>
+                <w:lang w:val="it-IT" w:bidi="ta-IN"/>
+              </w:rPr>
+              <w:t>5.4.</w:t>
+            </w:r>
+            <w:r>
+              <w:rPr>
+                <w:rFonts w:cs="Latha"/>
+                <w:b/>
+                <w:sz w:val="28"/>
+                <w:szCs w:val="28"/>
+                <w:lang w:val="it-IT" w:bidi="ta-IN"/>
+              </w:rPr>
+              <w:t>5</w:t>
+            </w:r>
+            <w:r>
+              <w:rPr>
+                <w:rFonts w:cs="Latha"/>
+                <w:b/>
+                <w:sz w:val="28"/>
+                <w:szCs w:val="28"/>
+                <w:lang w:val="it-IT" w:bidi="ta-IN"/>
+              </w:rPr>
+              <w:t>.</w:t>
+            </w:r>
+            <w:r>
+              <w:rPr>
+                <w:rFonts w:cs="Latha"/>
+                <w:b/>
+                <w:sz w:val="28"/>
+                <w:szCs w:val="28"/>
+                <w:lang w:val="it-IT" w:bidi="ta-IN"/>
+              </w:rPr>
+              <w:t>2</w:t>
+            </w:r>
+            <w:r>
+              <w:rPr>
+                <w:rFonts w:cs="Latha"/>
+                <w:b/>
+                <w:sz w:val="28"/>
+                <w:szCs w:val="28"/>
+                <w:lang w:val="it-IT" w:bidi="ta-IN"/>
+              </w:rPr>
+              <w:t xml:space="preserve"> – </w:t>
+            </w:r>
+            <w:r>
+              <w:rPr>
+                <w:rFonts w:cs="Latha"/>
+                <w:b/>
+                <w:sz w:val="28"/>
+                <w:szCs w:val="28"/>
+                <w:lang w:val="it-IT" w:bidi="ta-IN"/>
+              </w:rPr>
+              <w:t>vAkyam</w:t>
+            </w:r>
+          </w:p>
+          <w:p>
+            <w:pPr>
+              <w:spacing w:before="0" w:line="240" w:lineRule="auto"/>
+              <w:rPr>
+                <w:rFonts w:cs="Latha"/>
+                <w:b/>
+                <w:sz w:val="28"/>
+                <w:szCs w:val="28"/>
+                <w:lang w:val="it-IT" w:bidi="ta-IN"/>
+              </w:rPr>
+            </w:pPr>
+            <w:r>
+              <w:rPr>
+                <w:rFonts w:cs="Latha"/>
+                <w:b/>
+                <w:sz w:val="28"/>
+                <w:szCs w:val="28"/>
+                <w:lang w:val="it-IT" w:bidi="ta-IN"/>
+              </w:rPr>
+              <w:t>Line 7</w:t>
+            </w:r>
+          </w:p>
+          <w:p>
+            <w:pPr>
+              <w:spacing w:before="0" w:line="240" w:lineRule="auto"/>
+              <w:rPr>
+                <w:sz w:val="32"/>
+                <w:szCs w:val="32"/>
+                <w:lang w:val="it-IT"/>
+              </w:rPr>
+            </w:pPr>
+            <w:r>
+              <w:rPr>
+                <w:rFonts w:cs="Latha"/>
+                <w:b/>
+                <w:sz w:val="28"/>
+                <w:szCs w:val="28"/>
+                <w:lang w:val="it-IT" w:bidi="ta-IN"/>
+              </w:rPr>
+              <w:t xml:space="preserve">Panchaati No. - </w:t>
+            </w:r>
+            <w:r>
+              <w:rPr>
+                <w:rFonts w:cs="Latha"/>
+                <w:b/>
+                <w:sz w:val="28"/>
+                <w:szCs w:val="28"/>
+                <w:lang w:val="it-IT" w:bidi="ta-IN"/>
+              </w:rPr>
+              <w:t>20</w:t>
+            </w:r>
+          </w:p>
+        </w:tc>
+        <w:tc>
+          <w:tcPr>
+            <w:tcW w:w="5608" w:type="dxa"/>
+            <w:tcBorders>
+              <w:top w:val="single" w:sz="4" w:space="0" w:color="000000"/>
+              <w:left w:val="single" w:sz="4" w:space="0" w:color="000000"/>
+              <w:bottom w:val="single" w:sz="4" w:space="0" w:color="000000"/>
+              <w:right w:val="single" w:sz="4" w:space="0" w:color="000000"/>
+            </w:tcBorders>
+          </w:tcPr>
+          <w:p>
+            <w:pPr>
+              <w:widowControl w:val="0"/>
+              <w:autoSpaceDE w:val="0"/>
+              <w:autoSpaceDN w:val="0"/>
+              <w:adjustRightInd w:val="0"/>
+              <w:spacing w:before="0" w:line="240" w:lineRule="auto"/>
+              <w:rPr>
+                <w:sz w:val="32"/>
+                <w:szCs w:val="32"/>
+                <w:cs/>
+              </w:rPr>
+            </w:pPr>
+            <w:r>
+              <w:rPr>
+                <w:rFonts w:ascii="Latha" w:hAnsi="Latha" w:cs="Latha"/>
+                <w:sz w:val="28"/>
+                <w:szCs w:val="28"/>
+                <w:cs/>
+                <w:lang w:bidi="ta-IN"/>
+              </w:rPr>
+              <w:t>ம</w:t>
+            </w:r>
+            <w:r>
+              <w:rPr>
+                <w:rFonts w:ascii="BRH Tamil Tab Extra" w:hAnsi="BRH Tamil Tab Extra" w:cs="Latha"/>
+                <w:b/>
+                <w:sz w:val="36"/>
+                <w:szCs w:val="28"/>
+              </w:rPr>
+              <w:t>†</w:t>
+            </w:r>
+            <w:r>
+              <w:rPr>
+                <w:rFonts w:ascii="Latha" w:hAnsi="Latha" w:cs="Latha"/>
+                <w:sz w:val="28"/>
+                <w:szCs w:val="28"/>
+                <w:cs/>
+                <w:lang w:bidi="ta-IN"/>
+              </w:rPr>
+              <w:t>து</w:t>
+            </w:r>
+            <w:r>
+              <w:rPr>
+                <w:rFonts w:ascii="Latha" w:hAnsi="Latha" w:cs="Latha"/>
+                <w:b/>
+                <w:bCs/>
+                <w:position w:val="-12"/>
+                <w:sz w:val="28"/>
+                <w:szCs w:val="28"/>
+                <w:cs/>
+                <w:lang w:bidi="ta-IN"/>
+              </w:rPr>
+              <w:t>4</w:t>
+            </w:r>
+            <w:r>
+              <w:rPr>
+                <w:rFonts w:ascii="Latha" w:hAnsi="Latha" w:cs="Latha"/>
+                <w:sz w:val="28"/>
+                <w:szCs w:val="28"/>
+                <w:cs/>
+                <w:lang w:bidi="ta-IN"/>
+              </w:rPr>
+              <w:t>மி</w:t>
+            </w:r>
+            <w:r>
+              <w:rPr>
+                <w:rFonts w:ascii="BRH Tamil Tab Extra" w:hAnsi="BRH Tamil Tab Extra" w:cs="Latha"/>
+                <w:b/>
+                <w:sz w:val="36"/>
+                <w:szCs w:val="28"/>
+              </w:rPr>
+              <w:t>…</w:t>
+            </w:r>
+            <w:r>
+              <w:rPr>
+                <w:rFonts w:ascii="Latha" w:hAnsi="Latha" w:cs="Latha"/>
+                <w:sz w:val="28"/>
+                <w:szCs w:val="28"/>
+                <w:cs/>
+                <w:lang w:bidi="ta-IN"/>
+              </w:rPr>
+              <w:t>ஶ்ரே</w:t>
+            </w:r>
+            <w:r>
+              <w:rPr>
+                <w:rFonts w:ascii="Latha" w:hAnsi="Latha" w:cs="Latha"/>
+                <w:sz w:val="28"/>
+                <w:szCs w:val="28"/>
+                <w:highlight w:val="yellow"/>
+                <w:cs/>
+                <w:lang w:bidi="ta-IN"/>
+              </w:rPr>
+              <w:t>ணா</w:t>
+            </w:r>
+            <w:r>
+              <w:rPr>
+                <w:rFonts w:ascii="BRH Tamil Tab Extra" w:hAnsi="BRH Tamil Tab Extra" w:cs="Latha"/>
+                <w:b/>
+                <w:sz w:val="36"/>
+                <w:szCs w:val="28"/>
+                <w:highlight w:val="yellow"/>
+              </w:rPr>
+              <w:t>…</w:t>
+            </w:r>
+            <w:r>
+              <w:rPr>
+                <w:rFonts w:ascii="Latha" w:hAnsi="Latha" w:cs="Latha"/>
+                <w:sz w:val="28"/>
+                <w:szCs w:val="28"/>
+                <w:highlight w:val="yellow"/>
+              </w:rPr>
+              <w:t>-</w:t>
+            </w:r>
+            <w:r>
+              <w:rPr>
+                <w:rFonts w:ascii="Latha" w:hAnsi="Latha" w:cs="Latha"/>
+                <w:sz w:val="28"/>
+                <w:szCs w:val="28"/>
+                <w:highlight w:val="yellow"/>
+                <w:cs/>
+                <w:lang w:bidi="ta-IN"/>
+              </w:rPr>
+              <w:t>க்ஷ</w:t>
+            </w:r>
+            <w:r>
+              <w:rPr>
+                <w:rFonts w:ascii="BRH Tamil Tab Extra" w:hAnsi="BRH Tamil Tab Extra" w:cs="Latha"/>
+                <w:b/>
+                <w:sz w:val="36"/>
+                <w:szCs w:val="28"/>
+                <w:highlight w:val="yellow"/>
+              </w:rPr>
+              <w:t>†</w:t>
+            </w:r>
+            <w:r>
+              <w:rPr>
+                <w:rFonts w:ascii="Latha" w:hAnsi="Latha" w:cs="Latha"/>
+                <w:sz w:val="28"/>
+                <w:szCs w:val="28"/>
+                <w:cs/>
+                <w:lang w:bidi="ta-IN"/>
+              </w:rPr>
+              <w:t>த்யு</w:t>
+            </w:r>
+            <w:r>
+              <w:rPr>
+                <w:rFonts w:ascii="BRH Tamil Tab Extra" w:hAnsi="BRH Tamil Tab Extra" w:cs="Latha"/>
+                <w:b/>
+                <w:sz w:val="36"/>
+                <w:szCs w:val="28"/>
+              </w:rPr>
+              <w:t>…</w:t>
+            </w:r>
+            <w:r>
+              <w:rPr>
+                <w:rFonts w:ascii="Latha" w:hAnsi="Latha" w:cs="Latha"/>
+                <w:sz w:val="28"/>
+                <w:szCs w:val="28"/>
+                <w:cs/>
+                <w:lang w:bidi="ta-IN"/>
+              </w:rPr>
+              <w:t>ப</w:t>
+            </w:r>
+            <w:r>
+              <w:rPr>
+                <w:rFonts w:ascii="Latha" w:hAnsi="Latha" w:cs="Latha"/>
+                <w:b/>
+                <w:bCs/>
+                <w:position w:val="-12"/>
+                <w:sz w:val="28"/>
+                <w:szCs w:val="28"/>
+                <w:cs/>
+                <w:lang w:bidi="ta-IN"/>
+              </w:rPr>
+              <w:t>4</w:t>
+            </w:r>
+            <w:r>
+              <w:rPr>
+                <w:rFonts w:ascii="Latha" w:hAnsi="Latha" w:cs="Latha"/>
+                <w:sz w:val="28"/>
+                <w:szCs w:val="28"/>
+                <w:cs/>
+                <w:lang w:bidi="ta-IN"/>
+              </w:rPr>
+              <w:t>ய</w:t>
+            </w:r>
+            <w:r>
+              <w:rPr>
+                <w:rFonts w:ascii="BRH Tamil Tab Extra" w:hAnsi="BRH Tamil Tab Extra" w:cs="Latha"/>
+                <w:b/>
+                <w:sz w:val="36"/>
+                <w:szCs w:val="28"/>
+              </w:rPr>
+              <w:t>…</w:t>
+            </w:r>
+            <w:r>
+              <w:rPr>
+                <w:rFonts w:ascii="Latha" w:hAnsi="Latha" w:cs="Latha"/>
+                <w:sz w:val="28"/>
+                <w:szCs w:val="28"/>
+                <w:cs/>
+                <w:lang w:bidi="ta-IN"/>
+              </w:rPr>
+              <w:t>ஸ்யா</w:t>
+            </w:r>
+            <w:r>
+              <w:rPr>
+                <w:rFonts w:ascii="Latha" w:hAnsi="Latha" w:cs="Latha" w:hint="cs"/>
+                <w:sz w:val="28"/>
+                <w:szCs w:val="28"/>
+                <w:cs/>
+                <w:lang w:bidi="ta-IN"/>
+              </w:rPr>
+              <w:t>-</w:t>
+            </w:r>
+            <w:r>
+              <w:rPr>
+                <w:rFonts w:ascii="Latha" w:hAnsi="Latha" w:cs="Latha"/>
+                <w:sz w:val="28"/>
+                <w:szCs w:val="28"/>
+                <w:cs/>
+                <w:lang w:bidi="ta-IN"/>
+              </w:rPr>
+              <w:t>வ</w:t>
+            </w:r>
+            <w:r>
+              <w:rPr>
+                <w:rFonts w:ascii="BRH Tamil Tab Extra" w:hAnsi="BRH Tamil Tab Extra" w:cs="Latha"/>
+                <w:b/>
+                <w:sz w:val="36"/>
+                <w:szCs w:val="28"/>
+              </w:rPr>
+              <w:t>†</w:t>
+            </w:r>
+            <w:r>
+              <w:rPr>
+                <w:rFonts w:ascii="Latha" w:hAnsi="Latha" w:cs="Latha"/>
+                <w:sz w:val="28"/>
+                <w:szCs w:val="28"/>
+                <w:cs/>
+                <w:lang w:bidi="ta-IN"/>
+              </w:rPr>
+              <w:t>ருத்</w:t>
+            </w:r>
+            <w:r>
+              <w:rPr>
+                <w:rFonts w:ascii="Latha" w:hAnsi="Latha" w:cs="Latha"/>
+                <w:b/>
+                <w:bCs/>
+                <w:position w:val="-12"/>
+                <w:sz w:val="28"/>
+                <w:szCs w:val="28"/>
+                <w:cs/>
+                <w:lang w:bidi="ta-IN"/>
+              </w:rPr>
+              <w:t>3</w:t>
+            </w:r>
+            <w:r>
+              <w:rPr>
+                <w:rFonts w:ascii="Latha" w:hAnsi="Latha" w:cs="Latha"/>
+                <w:sz w:val="28"/>
+                <w:szCs w:val="28"/>
+                <w:cs/>
+                <w:lang w:bidi="ta-IN"/>
+              </w:rPr>
+              <w:t>த்</w:t>
+            </w:r>
+            <w:r>
+              <w:rPr>
+                <w:rFonts w:ascii="Latha" w:hAnsi="Latha" w:cs="Latha"/>
+                <w:b/>
+                <w:bCs/>
+                <w:position w:val="-12"/>
+                <w:sz w:val="28"/>
+                <w:szCs w:val="28"/>
+                <w:cs/>
+                <w:lang w:bidi="ta-IN"/>
+              </w:rPr>
+              <w:t>4</w:t>
+            </w:r>
+            <w:r>
+              <w:rPr>
+                <w:rFonts w:ascii="Latha" w:hAnsi="Latha" w:cs="Latha"/>
+                <w:sz w:val="28"/>
+                <w:szCs w:val="28"/>
+                <w:cs/>
+                <w:lang w:bidi="ta-IN"/>
+              </w:rPr>
+              <w:t>யை</w:t>
+            </w:r>
+          </w:p>
+        </w:tc>
+        <w:tc>
+          <w:tcPr>
+            <w:tcW w:w="6220" w:type="dxa"/>
+            <w:tcBorders>
+              <w:top w:val="single" w:sz="4" w:space="0" w:color="000000"/>
+              <w:left w:val="single" w:sz="4" w:space="0" w:color="000000"/>
+              <w:bottom w:val="single" w:sz="4" w:space="0" w:color="000000"/>
+              <w:right w:val="single" w:sz="4" w:space="0" w:color="000000"/>
+            </w:tcBorders>
+          </w:tcPr>
+          <w:p>
+            <w:pPr>
+              <w:spacing w:before="0" w:line="240" w:lineRule="auto"/>
+              <w:ind w:right="-18"/>
+              <w:rPr>
+                <w:sz w:val="32"/>
+                <w:szCs w:val="32"/>
+                <w:cs/>
+              </w:rPr>
+            </w:pPr>
+            <w:r>
+              <w:rPr>
+                <w:rFonts w:ascii="Latha" w:hAnsi="Latha" w:cs="Latha"/>
+                <w:sz w:val="28"/>
+                <w:szCs w:val="28"/>
+                <w:cs/>
+                <w:lang w:bidi="ta-IN"/>
+              </w:rPr>
+              <w:t>ம</w:t>
+            </w:r>
+            <w:r>
+              <w:rPr>
+                <w:rFonts w:ascii="BRH Tamil Tab Extra" w:hAnsi="BRH Tamil Tab Extra" w:cs="Latha"/>
+                <w:b/>
+                <w:sz w:val="36"/>
+                <w:szCs w:val="28"/>
+              </w:rPr>
+              <w:t>†</w:t>
+            </w:r>
+            <w:r>
+              <w:rPr>
+                <w:rFonts w:ascii="Latha" w:hAnsi="Latha" w:cs="Latha"/>
+                <w:sz w:val="28"/>
+                <w:szCs w:val="28"/>
+                <w:cs/>
+                <w:lang w:bidi="ta-IN"/>
+              </w:rPr>
+              <w:t>து</w:t>
+            </w:r>
+            <w:r>
+              <w:rPr>
+                <w:rFonts w:ascii="Latha" w:hAnsi="Latha" w:cs="Latha"/>
+                <w:b/>
+                <w:bCs/>
+                <w:position w:val="-12"/>
+                <w:sz w:val="28"/>
+                <w:szCs w:val="28"/>
+                <w:cs/>
+                <w:lang w:bidi="ta-IN"/>
+              </w:rPr>
+              <w:t>4</w:t>
+            </w:r>
+            <w:r>
+              <w:rPr>
+                <w:rFonts w:ascii="Latha" w:hAnsi="Latha" w:cs="Latha"/>
+                <w:sz w:val="28"/>
+                <w:szCs w:val="28"/>
+                <w:cs/>
+                <w:lang w:bidi="ta-IN"/>
+              </w:rPr>
+              <w:t>மி</w:t>
+            </w:r>
+            <w:r>
+              <w:rPr>
+                <w:rFonts w:ascii="BRH Tamil Tab Extra" w:hAnsi="BRH Tamil Tab Extra" w:cs="Latha"/>
+                <w:b/>
+                <w:sz w:val="36"/>
+                <w:szCs w:val="28"/>
+              </w:rPr>
+              <w:t>…</w:t>
+            </w:r>
+            <w:r>
+              <w:rPr>
+                <w:rFonts w:ascii="Latha" w:hAnsi="Latha" w:cs="Latha"/>
+                <w:sz w:val="28"/>
+                <w:szCs w:val="28"/>
+                <w:cs/>
+                <w:lang w:bidi="ta-IN"/>
+              </w:rPr>
+              <w:t>ஶ்ரே</w:t>
+            </w:r>
+            <w:r>
+              <w:rPr>
+                <w:rFonts w:ascii="Latha" w:hAnsi="Latha" w:cs="Latha"/>
+                <w:sz w:val="28"/>
+                <w:szCs w:val="28"/>
+                <w:highlight w:val="green"/>
+                <w:cs/>
+                <w:lang w:bidi="ta-IN"/>
+              </w:rPr>
+              <w:t>ணா</w:t>
+            </w:r>
+            <w:r>
+              <w:rPr>
+                <w:rFonts w:ascii="BRH Tamil Tab Extra" w:hAnsi="BRH Tamil Tab Extra" w:cs="Latha"/>
+                <w:b/>
+                <w:sz w:val="36"/>
+                <w:szCs w:val="28"/>
+                <w:highlight w:val="green"/>
+              </w:rPr>
+              <w:t>…</w:t>
+            </w:r>
+            <w:r>
+              <w:rPr>
+                <w:rFonts w:ascii="Latha" w:hAnsi="Latha" w:cs="Latha"/>
+                <w:sz w:val="28"/>
+                <w:szCs w:val="28"/>
+                <w:highlight w:val="green"/>
+              </w:rPr>
+              <w:t>-</w:t>
+            </w:r>
+            <w:r>
+              <w:rPr>
+                <w:rFonts w:ascii="Latha" w:hAnsi="Latha" w:cs="Latha"/>
+                <w:sz w:val="28"/>
+                <w:szCs w:val="28"/>
+                <w:highlight w:val="green"/>
+                <w:cs/>
+                <w:lang w:bidi="ta-IN"/>
+              </w:rPr>
+              <w:t>வோ</w:t>
+            </w:r>
+            <w:r>
+              <w:rPr>
+                <w:rFonts w:ascii="Latha" w:hAnsi="Latha" w:cs="Latha"/>
+                <w:sz w:val="28"/>
+                <w:szCs w:val="28"/>
+                <w:highlight w:val="green"/>
+                <w:cs/>
+                <w:lang w:bidi="ta-IN"/>
+              </w:rPr>
+              <w:t>க்ஷ</w:t>
+            </w:r>
+            <w:r>
+              <w:rPr>
+                <w:rFonts w:ascii="BRH Tamil Tab Extra" w:hAnsi="BRH Tamil Tab Extra" w:cs="Latha"/>
+                <w:b/>
+                <w:sz w:val="36"/>
+                <w:szCs w:val="28"/>
+                <w:highlight w:val="yellow"/>
+              </w:rPr>
+              <w:t>†</w:t>
+            </w:r>
+            <w:r>
+              <w:rPr>
+                <w:rFonts w:ascii="Latha" w:hAnsi="Latha" w:cs="Latha"/>
+                <w:sz w:val="28"/>
+                <w:szCs w:val="28"/>
+                <w:cs/>
+                <w:lang w:bidi="ta-IN"/>
+              </w:rPr>
+              <w:t>த்யு</w:t>
+            </w:r>
+            <w:r>
+              <w:rPr>
+                <w:rFonts w:ascii="BRH Tamil Tab Extra" w:hAnsi="BRH Tamil Tab Extra" w:cs="Latha"/>
+                <w:b/>
+                <w:sz w:val="36"/>
+                <w:szCs w:val="28"/>
+                <w:highlight w:val="yellow"/>
+              </w:rPr>
+              <w:t>…</w:t>
+            </w:r>
+            <w:r>
+              <w:rPr>
+                <w:rFonts w:ascii="Latha" w:hAnsi="Latha" w:cs="Latha"/>
+                <w:sz w:val="28"/>
+                <w:szCs w:val="28"/>
+                <w:cs/>
+                <w:lang w:bidi="ta-IN"/>
+              </w:rPr>
+              <w:t>ப</w:t>
+            </w:r>
+            <w:r>
+              <w:rPr>
+                <w:rFonts w:ascii="Latha" w:hAnsi="Latha" w:cs="Latha"/>
+                <w:b/>
+                <w:bCs/>
+                <w:position w:val="-12"/>
+                <w:sz w:val="28"/>
+                <w:szCs w:val="28"/>
+                <w:cs/>
+                <w:lang w:bidi="ta-IN"/>
+              </w:rPr>
+              <w:t>4</w:t>
+            </w:r>
+            <w:r>
+              <w:rPr>
+                <w:rFonts w:ascii="Latha" w:hAnsi="Latha" w:cs="Latha"/>
+                <w:sz w:val="28"/>
+                <w:szCs w:val="28"/>
+                <w:cs/>
+                <w:lang w:bidi="ta-IN"/>
+              </w:rPr>
+              <w:t>ய</w:t>
+            </w:r>
+            <w:r>
+              <w:rPr>
+                <w:rFonts w:ascii="BRH Tamil Tab Extra" w:hAnsi="BRH Tamil Tab Extra" w:cs="Latha"/>
+                <w:b/>
+                <w:sz w:val="36"/>
+                <w:szCs w:val="28"/>
+              </w:rPr>
+              <w:t>…</w:t>
+            </w:r>
+            <w:r>
+              <w:rPr>
+                <w:rFonts w:ascii="Latha" w:hAnsi="Latha" w:cs="Latha"/>
+                <w:sz w:val="28"/>
+                <w:szCs w:val="28"/>
+                <w:cs/>
+                <w:lang w:bidi="ta-IN"/>
+              </w:rPr>
+              <w:t>ஸ்யா</w:t>
+            </w:r>
+            <w:r>
+              <w:rPr>
+                <w:rFonts w:ascii="Latha" w:hAnsi="Latha" w:cs="Latha" w:hint="cs"/>
+                <w:sz w:val="28"/>
+                <w:szCs w:val="28"/>
+                <w:cs/>
+                <w:lang w:bidi="ta-IN"/>
+              </w:rPr>
+              <w:t>-</w:t>
+            </w:r>
+            <w:r>
+              <w:rPr>
+                <w:rFonts w:ascii="Latha" w:hAnsi="Latha" w:cs="Latha"/>
+                <w:sz w:val="28"/>
+                <w:szCs w:val="28"/>
+                <w:cs/>
+                <w:lang w:bidi="ta-IN"/>
+              </w:rPr>
+              <w:t>வ</w:t>
+            </w:r>
+            <w:r>
+              <w:rPr>
+                <w:rFonts w:ascii="BRH Tamil Tab Extra" w:hAnsi="BRH Tamil Tab Extra" w:cs="Latha"/>
+                <w:b/>
+                <w:sz w:val="36"/>
+                <w:szCs w:val="28"/>
+              </w:rPr>
+              <w:t>†</w:t>
+            </w:r>
+            <w:r>
+              <w:rPr>
+                <w:rFonts w:ascii="Latha" w:hAnsi="Latha" w:cs="Latha"/>
+                <w:sz w:val="28"/>
+                <w:szCs w:val="28"/>
+                <w:cs/>
+                <w:lang w:bidi="ta-IN"/>
+              </w:rPr>
+              <w:t>ருத்</w:t>
+            </w:r>
+            <w:r>
+              <w:rPr>
+                <w:rFonts w:ascii="Latha" w:hAnsi="Latha" w:cs="Latha"/>
+                <w:b/>
+                <w:bCs/>
+                <w:position w:val="-12"/>
+                <w:sz w:val="28"/>
+                <w:szCs w:val="28"/>
+                <w:cs/>
+                <w:lang w:bidi="ta-IN"/>
+              </w:rPr>
+              <w:t>3</w:t>
+            </w:r>
+            <w:r>
+              <w:rPr>
+                <w:rFonts w:ascii="Latha" w:hAnsi="Latha" w:cs="Latha"/>
+                <w:sz w:val="28"/>
+                <w:szCs w:val="28"/>
+                <w:cs/>
+                <w:lang w:bidi="ta-IN"/>
+              </w:rPr>
+              <w:t>த்</w:t>
+            </w:r>
+            <w:r>
+              <w:rPr>
+                <w:rFonts w:ascii="Latha" w:hAnsi="Latha" w:cs="Latha"/>
+                <w:b/>
+                <w:bCs/>
+                <w:position w:val="-12"/>
+                <w:sz w:val="28"/>
+                <w:szCs w:val="28"/>
+                <w:cs/>
+                <w:lang w:bidi="ta-IN"/>
+              </w:rPr>
+              <w:t>4</w:t>
+            </w:r>
+            <w:r>
+              <w:rPr>
+                <w:rFonts w:ascii="Latha" w:hAnsi="Latha" w:cs="Latha"/>
+                <w:sz w:val="28"/>
+                <w:szCs w:val="28"/>
+                <w:cs/>
+                <w:lang w:bidi="ta-IN"/>
+              </w:rPr>
+              <w:t>யை</w:t>
+            </w:r>
+          </w:p>
+        </w:tc>
+      </w:tr>
+    </w:tbl>
+    <w:p>
+      <w:pPr>
+        <w:spacing w:before="0" w:line="240" w:lineRule="auto"/>
+        <w:jc w:val="center"/>
+        <w:rPr>
+          <w:b/>
+          <w:bCs/>
+          <w:sz w:val="32"/>
+          <w:szCs w:val="32"/>
+          <w:u w:val="single"/>
+        </w:rPr>
+      </w:pPr>
+    </w:p>
+    <w:p>
+      <w:pPr>
+        <w:spacing w:before="0" w:line="240" w:lineRule="auto"/>
+        <w:jc w:val="center"/>
+        <w:rPr>
+          <w:b/>
+          <w:bCs/>
+          <w:sz w:val="32"/>
+          <w:szCs w:val="32"/>
+          <w:u w:val="single"/>
+        </w:rPr>
+      </w:pPr>
+    </w:p>
+    <w:p>
+      <w:pPr>
+        <w:spacing w:before="0" w:line="240" w:lineRule="auto"/>
+        <w:jc w:val="center"/>
+        <w:rPr>
+          <w:b/>
+          <w:bCs/>
+          <w:sz w:val="32"/>
+          <w:szCs w:val="32"/>
+          <w:u w:val="single"/>
+        </w:rPr>
+      </w:pPr>
+    </w:p>
+    <w:p>
+      <w:pPr>
+        <w:spacing w:before="0" w:line="240" w:lineRule="auto"/>
+        <w:jc w:val="center"/>
+        <w:rPr>
+          <w:b/>
+          <w:bCs/>
+          <w:sz w:val="32"/>
+          <w:szCs w:val="32"/>
+          <w:u w:val="single"/>
+        </w:rPr>
+      </w:pPr>
+    </w:p>
+    <w:p>
+      <w:pPr>
+        <w:spacing w:before="0" w:line="240" w:lineRule="auto"/>
+        <w:jc w:val="center"/>
+        <w:rPr>
+          <w:b/>
+          <w:bCs/>
+          <w:sz w:val="32"/>
+          <w:szCs w:val="32"/>
+          <w:u w:val="single"/>
+        </w:rPr>
+      </w:pPr>
+    </w:p>
+    <w:p>
+      <w:pPr>
+        <w:spacing w:before="0" w:line="240" w:lineRule="auto"/>
+        <w:jc w:val="center"/>
+        <w:rPr>
+          <w:b/>
+          <w:bCs/>
+        </w:rPr>
+      </w:pPr>
+      <w:r>
+        <w:rPr>
+          <w:b/>
+          <w:bCs/>
+          <w:sz w:val="32"/>
+          <w:szCs w:val="32"/>
+          <w:u w:val="single"/>
+        </w:rPr>
+        <w:t xml:space="preserve">TS Pada Paatam – TS 5.4 </w:t>
       </w:r>
       <w:r>
         <w:rPr>
@@ -902,7 +1893,6 @@
               </w:rPr>
               <w:t xml:space="preserve"> - </w:t>
             </w:r>
-            <w:proofErr w:type="spellStart"/>
             <w:r>
               <w:rPr>
                 <w:rFonts w:cs="Latha"/>
@@ -913,7 +1903,6 @@
               </w:rPr>
               <w:t>Vaakyam</w:t>
             </w:r>
-            <w:proofErr w:type="spellEnd"/>
           </w:p>
           <w:p>
             <w:pPr>
@@ -967,7 +1956,6 @@
                 <w:lang w:bidi="ta-IN"/>
               </w:rPr>
             </w:pPr>
-            <w:proofErr w:type="spellStart"/>
             <w:r>
               <w:rPr>
                 <w:rFonts w:cs="Latha"/>
@@ -976,18 +1964,7 @@
                 <w:szCs w:val="28"/>
                 <w:lang w:bidi="ta-IN"/>
               </w:rPr>
-              <w:t>Panchaati</w:t>
-            </w:r>
-            <w:proofErr w:type="spellEnd"/>
-            <w:r>
-              <w:rPr>
-                <w:rFonts w:cs="Latha"/>
-                <w:b/>
-                <w:sz w:val="28"/>
-                <w:szCs w:val="28"/>
-                <w:lang w:bidi="ta-IN"/>
-              </w:rPr>
-              <w:t xml:space="preserve"> No. - </w:t>
+              <w:t xml:space="preserve">Panchaati No. - </w:t>
             </w:r>
             <w:r>
               <w:rPr>
@@ -1642,6 +2619,7 @@
                 <w:cs/>
                 <w:lang w:bidi="ta-IN"/>
               </w:rPr>
+              <w:lastRenderedPageBreak/>
               <w:t>க்</w:t>
             </w:r>
             <w:r>
@@ -1816,6 +2794,7 @@
                 <w:cs/>
                 <w:lang w:bidi="ta-IN"/>
               </w:rPr>
+              <w:lastRenderedPageBreak/>
               <w:t>உ</w:t>
             </w:r>
             <w:r>
@@ -1975,6 +2954,7 @@
                 <w:cs/>
                 <w:lang w:bidi="ta-IN"/>
               </w:rPr>
+              <w:lastRenderedPageBreak/>
               <w:t>க்</w:t>
             </w:r>
             <w:r>
@@ -2152,6 +3132,7 @@
                 <w:szCs w:val="28"/>
                 <w:lang w:val="it-IT" w:bidi="ta-IN"/>
               </w:rPr>
+              <w:lastRenderedPageBreak/>
               <w:t>5.4.9.1 – Padam</w:t>
             </w:r>
           </w:p>
@@ -2908,7 +3889,6 @@
               </w:rPr>
               <w:t xml:space="preserve"> – </w:t>
             </w:r>
-            <w:proofErr w:type="spellStart"/>
             <w:r>
               <w:rPr>
                 <w:rFonts w:cs="Latha"/>
@@ -2919,7 +3899,6 @@
               </w:rPr>
               <w:t>Vaakyam</w:t>
             </w:r>
-            <w:proofErr w:type="spellEnd"/>
           </w:p>
           <w:p>
             <w:pPr>
@@ -2974,7 +3953,6 @@
                 <w:lang w:bidi="ta-IN"/>
               </w:rPr>
             </w:pPr>
-            <w:proofErr w:type="spellStart"/>
             <w:r>
               <w:rPr>
                 <w:rFonts w:cs="Latha"/>
@@ -2983,18 +3961,7 @@
                 <w:szCs w:val="28"/>
                 <w:lang w:bidi="ta-IN"/>
               </w:rPr>
-              <w:t>Panchaati</w:t>
-            </w:r>
-            <w:proofErr w:type="spellEnd"/>
-            <w:r>
-              <w:rPr>
-                <w:rFonts w:cs="Latha"/>
-                <w:b/>
-                <w:sz w:val="28"/>
-                <w:szCs w:val="28"/>
-                <w:lang w:bidi="ta-IN"/>
-              </w:rPr>
-              <w:t xml:space="preserve"> No. - </w:t>
+              <w:t xml:space="preserve">Panchaati No. - </w:t>
             </w:r>
             <w:r>
               <w:rPr>
@@ -3266,30 +4233,7 @@
           <w:szCs w:val="32"/>
           <w:u w:val="single"/>
         </w:rPr>
-        <w:lastRenderedPageBreak/>
-        <w:t xml:space="preserve">TS Pada </w:t>
-      </w:r>
-      <w:proofErr w:type="spellStart"/>
-      <w:r>
-        <w:rPr>
-          <w:b/>
-          <w:bCs/>
-          <w:sz w:val="32"/>
-          <w:szCs w:val="32"/>
-          <w:u w:val="single"/>
-        </w:rPr>
-        <w:t>Paatam</w:t>
-      </w:r>
-      <w:proofErr w:type="spellEnd"/>
-      <w:r>
-        <w:rPr>
-          <w:b/>
-          <w:bCs/>
-          <w:sz w:val="32"/>
-          <w:szCs w:val="32"/>
-          <w:u w:val="single"/>
-        </w:rPr>
-        <w:t xml:space="preserve"> – TS 5.4 Tamil co</w:t>
+        <w:t>TS Pada Paatam – TS 5.4 Tamil co</w:t>
       </w:r>
       <w:r>
         <w:rPr>
@@ -3530,25 +4474,14 @@
                 <w:szCs w:val="28"/>
               </w:rPr>
             </w:pPr>
-            <w:proofErr w:type="spellStart"/>
-            <w:r>
-              <w:rPr>
-                <w:b/>
-                <w:bCs/>
-                <w:sz w:val="28"/>
-                <w:szCs w:val="28"/>
-              </w:rPr>
-              <w:t>Panchaati</w:t>
-            </w:r>
-            <w:proofErr w:type="spellEnd"/>
-            <w:r>
-              <w:rPr>
-                <w:b/>
-                <w:bCs/>
-                <w:sz w:val="28"/>
-                <w:szCs w:val="28"/>
-              </w:rPr>
-              <w:t xml:space="preserve"> 7</w:t>
+            <w:r>
+              <w:rPr>
+                <w:b/>
+                <w:bCs/>
+                <w:sz w:val="28"/>
+                <w:szCs w:val="28"/>
+              </w:rPr>
+              <w:t>Panchaati 7</w:t>
             </w:r>
           </w:p>
         </w:tc>
@@ -3969,20 +4902,8 @@
                 <w:szCs w:val="28"/>
                 <w:lang w:bidi="ta-IN"/>
               </w:rPr>
-              <w:t xml:space="preserve"> – </w:t>
-            </w:r>
-            <w:proofErr w:type="spellStart"/>
-            <w:r>
-              <w:rPr>
-                <w:rFonts w:cs="Latha"/>
-                <w:b/>
-                <w:sz w:val="28"/>
-                <w:szCs w:val="28"/>
-                <w:lang w:bidi="ta-IN"/>
-              </w:rPr>
-              <w:t>Vaakyam</w:t>
-            </w:r>
-            <w:proofErr w:type="spellEnd"/>
+              <w:t xml:space="preserve"> – Vaakyam</w:t>
+            </w:r>
           </w:p>
           <w:p>
             <w:pPr>
@@ -4036,7 +4957,6 @@
                 <w:lang w:bidi="ta-IN"/>
               </w:rPr>
             </w:pPr>
-            <w:proofErr w:type="spellStart"/>
             <w:r>
               <w:rPr>
                 <w:rFonts w:cs="Latha"/>
@@ -4045,18 +4965,7 @@
                 <w:szCs w:val="28"/>
                 <w:lang w:bidi="ta-IN"/>
               </w:rPr>
-              <w:t>Panchaati</w:t>
-            </w:r>
-            <w:proofErr w:type="spellEnd"/>
-            <w:r>
-              <w:rPr>
-                <w:rFonts w:cs="Latha"/>
-                <w:b/>
-                <w:sz w:val="28"/>
-                <w:szCs w:val="28"/>
-                <w:lang w:bidi="ta-IN"/>
-              </w:rPr>
-              <w:t xml:space="preserve"> No. - </w:t>
+              <w:t xml:space="preserve">Panchaati No. - </w:t>
             </w:r>
             <w:r>
               <w:rPr>
@@ -4508,6 +5417,7 @@
                 <w:szCs w:val="28"/>
                 <w:lang w:val="it-IT" w:bidi="ta-IN"/>
               </w:rPr>
+              <w:lastRenderedPageBreak/>
               <w:t>5.4.7.4 – Padam</w:t>
             </w:r>
           </w:p>
@@ -5299,20 +6209,8 @@
                 <w:szCs w:val="28"/>
                 <w:lang w:bidi="ta-IN"/>
               </w:rPr>
-              <w:t xml:space="preserve"> – </w:t>
-            </w:r>
-            <w:proofErr w:type="spellStart"/>
-            <w:r>
-              <w:rPr>
-                <w:rFonts w:cs="Latha"/>
-                <w:b/>
-                <w:sz w:val="28"/>
-                <w:szCs w:val="28"/>
-                <w:lang w:bidi="ta-IN"/>
-              </w:rPr>
-              <w:t>Vaakyam</w:t>
-            </w:r>
-            <w:proofErr w:type="spellEnd"/>
+              <w:t xml:space="preserve"> – Vaakyam</w:t>
+            </w:r>
           </w:p>
           <w:p>
             <w:pPr>
@@ -5357,7 +6255,6 @@
                 <w:lang w:bidi="ta-IN"/>
               </w:rPr>
             </w:pPr>
-            <w:proofErr w:type="spellStart"/>
             <w:r>
               <w:rPr>
                 <w:rFonts w:cs="Latha"/>
@@ -5366,18 +6263,7 @@
                 <w:szCs w:val="28"/>
                 <w:lang w:bidi="ta-IN"/>
               </w:rPr>
-              <w:t>Panchaati</w:t>
-            </w:r>
-            <w:proofErr w:type="spellEnd"/>
-            <w:r>
-              <w:rPr>
-                <w:rFonts w:cs="Latha"/>
-                <w:b/>
-                <w:sz w:val="28"/>
-                <w:szCs w:val="28"/>
-                <w:lang w:bidi="ta-IN"/>
-              </w:rPr>
-              <w:t xml:space="preserve"> No. - </w:t>
+              <w:t xml:space="preserve">Panchaati No. - </w:t>
             </w:r>
             <w:r>
               <w:rPr>
@@ -5774,7 +6660,6 @@
                 <w:lang w:bidi="ta-IN"/>
               </w:rPr>
             </w:pPr>
-            <w:proofErr w:type="spellStart"/>
             <w:r>
               <w:rPr>
                 <w:rFonts w:cs="Latha"/>
@@ -5784,19 +6669,7 @@
                 <w:szCs w:val="28"/>
                 <w:lang w:bidi="ta-IN"/>
               </w:rPr>
-              <w:t>Panchaati</w:t>
-            </w:r>
-            <w:proofErr w:type="spellEnd"/>
-            <w:r>
-              <w:rPr>
-                <w:rFonts w:cs="Latha"/>
-                <w:b/>
-                <w:bCs/>
-                <w:sz w:val="28"/>
-                <w:szCs w:val="28"/>
-                <w:lang w:bidi="ta-IN"/>
-              </w:rPr>
-              <w:t xml:space="preserve"> 42</w:t>
+              <w:t>Panchaati 42</w:t>
             </w:r>
           </w:p>
         </w:tc>
@@ -6142,7 +7015,6 @@
                 <w:szCs w:val="28"/>
                 <w:lang w:bidi="ta-IN"/>
               </w:rPr>
-              <w:lastRenderedPageBreak/>
               <w:t>5.4.9.2</w:t>
             </w:r>
             <w:r>
@@ -6153,20 +7025,8 @@
                 <w:szCs w:val="28"/>
                 <w:lang w:bidi="ta-IN"/>
               </w:rPr>
-              <w:t xml:space="preserve"> – </w:t>
-            </w:r>
-            <w:proofErr w:type="spellStart"/>
-            <w:r>
-              <w:rPr>
-                <w:rFonts w:cs="Latha"/>
-                <w:b/>
-                <w:sz w:val="28"/>
-                <w:szCs w:val="28"/>
-                <w:lang w:bidi="ta-IN"/>
-              </w:rPr>
-              <w:t>Vaakyam</w:t>
-            </w:r>
-            <w:proofErr w:type="spellEnd"/>
+              <w:t xml:space="preserve"> – Vaakyam</w:t>
+            </w:r>
           </w:p>
           <w:p>
             <w:pPr>
@@ -6212,7 +7072,6 @@
                 <w:lang w:bidi="ta-IN"/>
               </w:rPr>
             </w:pPr>
-            <w:proofErr w:type="spellStart"/>
             <w:r>
               <w:rPr>
                 <w:rFonts w:cs="Latha"/>
@@ -6221,18 +7080,7 @@
                 <w:szCs w:val="28"/>
                 <w:lang w:bidi="ta-IN"/>
               </w:rPr>
-              <w:t>Panchaati</w:t>
-            </w:r>
-            <w:proofErr w:type="spellEnd"/>
-            <w:r>
-              <w:rPr>
-                <w:rFonts w:cs="Latha"/>
-                <w:b/>
-                <w:sz w:val="28"/>
-                <w:szCs w:val="28"/>
-                <w:lang w:bidi="ta-IN"/>
-              </w:rPr>
-              <w:t xml:space="preserve"> No. - </w:t>
+              <w:t xml:space="preserve">Panchaati No. - </w:t>
             </w:r>
             <w:r>
               <w:rPr>
@@ -7030,20 +7878,8 @@
                 <w:szCs w:val="28"/>
                 <w:lang w:bidi="ta-IN"/>
               </w:rPr>
-              <w:t xml:space="preserve"> – </w:t>
-            </w:r>
-            <w:proofErr w:type="spellStart"/>
-            <w:r>
-              <w:rPr>
-                <w:rFonts w:cs="Latha"/>
-                <w:b/>
-                <w:sz w:val="28"/>
-                <w:szCs w:val="28"/>
-                <w:lang w:bidi="ta-IN"/>
-              </w:rPr>
-              <w:t>Vaakyam</w:t>
-            </w:r>
-            <w:proofErr w:type="spellEnd"/>
+              <w:t xml:space="preserve"> – Vaakyam</w:t>
+            </w:r>
           </w:p>
           <w:p>
             <w:pPr>
@@ -7089,7 +7925,6 @@
                 <w:lang w:bidi="ta-IN"/>
               </w:rPr>
             </w:pPr>
-            <w:proofErr w:type="spellStart"/>
             <w:r>
               <w:rPr>
                 <w:rFonts w:cs="Latha"/>
@@ -7098,18 +7933,7 @@
                 <w:szCs w:val="28"/>
                 <w:lang w:bidi="ta-IN"/>
               </w:rPr>
-              <w:t>Panchaati</w:t>
-            </w:r>
-            <w:proofErr w:type="spellEnd"/>
-            <w:r>
-              <w:rPr>
-                <w:rFonts w:cs="Latha"/>
-                <w:b/>
-                <w:sz w:val="28"/>
-                <w:szCs w:val="28"/>
-                <w:lang w:bidi="ta-IN"/>
-              </w:rPr>
-              <w:t xml:space="preserve"> No. - </w:t>
+              <w:t xml:space="preserve">Panchaati No. - </w:t>
             </w:r>
             <w:r>
               <w:rPr>
@@ -7497,7 +8321,6 @@
                 <w:lang w:bidi="ta-IN"/>
               </w:rPr>
             </w:pPr>
-            <w:proofErr w:type="spellStart"/>
             <w:r>
               <w:rPr>
                 <w:rFonts w:cs="Latha"/>
@@ -7507,19 +8330,7 @@
                 <w:szCs w:val="28"/>
                 <w:lang w:bidi="ta-IN"/>
               </w:rPr>
-              <w:t>Panchaati</w:t>
-            </w:r>
-            <w:proofErr w:type="spellEnd"/>
-            <w:r>
-              <w:rPr>
-                <w:rFonts w:cs="Latha"/>
-                <w:b/>
-                <w:bCs/>
-                <w:sz w:val="28"/>
-                <w:szCs w:val="28"/>
-                <w:lang w:bidi="ta-IN"/>
-              </w:rPr>
-              <w:t xml:space="preserve"> 56</w:t>
+              <w:t>Panchaati 56</w:t>
             </w:r>
           </w:p>
         </w:tc>
@@ -7887,29 +8698,7 @@
           <w:u w:val="single"/>
         </w:rPr>
         <w:lastRenderedPageBreak/>
-        <w:t xml:space="preserve">TS Pada </w:t>
-      </w:r>
-      <w:proofErr w:type="spellStart"/>
-      <w:r>
-        <w:rPr>
-          <w:b/>
-          <w:bCs/>
-          <w:sz w:val="32"/>
-          <w:szCs w:val="32"/>
-          <w:u w:val="single"/>
-        </w:rPr>
-        <w:t>Paatam</w:t>
-      </w:r>
-      <w:proofErr w:type="spellEnd"/>
-      <w:r>
-        <w:rPr>
-          <w:b/>
-          <w:bCs/>
-          <w:sz w:val="32"/>
-          <w:szCs w:val="32"/>
-          <w:u w:val="single"/>
-        </w:rPr>
-        <w:t xml:space="preserve"> – TS 5.4 Tamil co</w:t>
+        <w:t>TS Pada Paatam – TS 5.4 Tamil co</w:t>
       </w:r>
       <w:r>
         <w:rPr>
@@ -10357,29 +11146,7 @@
           <w:u w:val="single"/>
         </w:rPr>
         <w:lastRenderedPageBreak/>
-        <w:t xml:space="preserve">TS Pada </w:t>
-      </w:r>
-      <w:proofErr w:type="spellStart"/>
-      <w:r>
-        <w:rPr>
-          <w:b/>
-          <w:bCs/>
-          <w:sz w:val="32"/>
-          <w:szCs w:val="32"/>
-          <w:u w:val="single"/>
-        </w:rPr>
-        <w:t>Paatam</w:t>
-      </w:r>
-      <w:proofErr w:type="spellEnd"/>
-      <w:r>
-        <w:rPr>
-          <w:b/>
-          <w:bCs/>
-          <w:sz w:val="32"/>
-          <w:szCs w:val="32"/>
-          <w:u w:val="single"/>
-        </w:rPr>
-        <w:t xml:space="preserve"> – TS 5.4 Tamil co</w:t>
+        <w:t>TS Pada Paatam – TS 5.4 Tamil co</w:t>
       </w:r>
       <w:r>
         <w:rPr>
@@ -10632,21 +11399,8 @@
                 <w:szCs w:val="28"/>
                 <w:lang w:bidi="ta-IN"/>
               </w:rPr>
-              <w:t xml:space="preserve">5th </w:t>
-            </w:r>
-            <w:proofErr w:type="spellStart"/>
-            <w:r>
-              <w:rPr>
-                <w:rFonts w:cs="Latha"/>
-                <w:b/>
-                <w:bCs/>
-                <w:sz w:val="28"/>
-                <w:szCs w:val="28"/>
-                <w:lang w:bidi="ta-IN"/>
-              </w:rPr>
-              <w:t>Panchaati</w:t>
-            </w:r>
-            <w:proofErr w:type="spellEnd"/>
+              <w:t>5th Panchaati</w:t>
+            </w:r>
           </w:p>
         </w:tc>
         <w:tc>
@@ -11379,7 +12133,6 @@
               </w:rPr>
               <w:t xml:space="preserve">lower </w:t>
             </w:r>
-            <w:proofErr w:type="spellStart"/>
             <w:r>
               <w:rPr>
                 <w:sz w:val="32"/>
@@ -11394,7 +12147,6 @@
               </w:rPr>
               <w:t>m</w:t>
             </w:r>
-            <w:proofErr w:type="spellEnd"/>
             <w:r>
               <w:rPr>
                 <w:sz w:val="32"/>
@@ -11457,21 +12209,8 @@
                 <w:szCs w:val="28"/>
                 <w:lang w:bidi="ta-IN"/>
               </w:rPr>
-              <w:t xml:space="preserve">TS 5.4.2.2 – </w:t>
-            </w:r>
-            <w:proofErr w:type="spellStart"/>
-            <w:r>
-              <w:rPr>
-                <w:rFonts w:cs="Latha"/>
-                <w:b/>
-                <w:bCs/>
-                <w:sz w:val="28"/>
-                <w:szCs w:val="28"/>
-                <w:lang w:bidi="ta-IN"/>
-              </w:rPr>
-              <w:t>Vaakyam</w:t>
-            </w:r>
-            <w:proofErr w:type="spellEnd"/>
+              <w:t>TS 5.4.2.2 – Vaakyam</w:t>
+            </w:r>
           </w:p>
           <w:p>
             <w:pPr>
@@ -11494,21 +12233,8 @@
                 <w:szCs w:val="28"/>
                 <w:lang w:bidi="ta-IN"/>
               </w:rPr>
-              <w:t xml:space="preserve">6th </w:t>
-            </w:r>
-            <w:proofErr w:type="spellStart"/>
-            <w:r>
-              <w:rPr>
-                <w:rFonts w:cs="Latha"/>
-                <w:b/>
-                <w:bCs/>
-                <w:sz w:val="28"/>
-                <w:szCs w:val="28"/>
-                <w:lang w:bidi="ta-IN"/>
-              </w:rPr>
-              <w:t>Panchaati</w:t>
-            </w:r>
-            <w:proofErr w:type="spellEnd"/>
+              <w:t>6th Panchaati</w:t>
+            </w:r>
           </w:p>
         </w:tc>
         <w:tc>
@@ -11891,21 +12617,8 @@
                 <w:szCs w:val="28"/>
                 <w:lang w:bidi="ta-IN"/>
               </w:rPr>
-              <w:t xml:space="preserve">27th </w:t>
-            </w:r>
-            <w:proofErr w:type="spellStart"/>
-            <w:r>
-              <w:rPr>
-                <w:rFonts w:cs="Latha"/>
-                <w:b/>
-                <w:bCs/>
-                <w:sz w:val="28"/>
-                <w:szCs w:val="28"/>
-                <w:lang w:bidi="ta-IN"/>
-              </w:rPr>
-              <w:t>Panchaati</w:t>
-            </w:r>
-            <w:proofErr w:type="spellEnd"/>
+              <w:t>27th Panchaati</w:t>
+            </w:r>
           </w:p>
         </w:tc>
         <w:tc>
@@ -12878,21 +13591,8 @@
                 <w:szCs w:val="28"/>
                 <w:lang w:bidi="ta-IN"/>
               </w:rPr>
-              <w:t xml:space="preserve">27th </w:t>
-            </w:r>
-            <w:proofErr w:type="spellStart"/>
-            <w:r>
-              <w:rPr>
-                <w:rFonts w:cs="Latha"/>
-                <w:b/>
-                <w:bCs/>
-                <w:sz w:val="28"/>
-                <w:szCs w:val="28"/>
-                <w:lang w:bidi="ta-IN"/>
-              </w:rPr>
-              <w:t>Panchaati</w:t>
-            </w:r>
-            <w:proofErr w:type="spellEnd"/>
+              <w:t>27th Panchaati</w:t>
+            </w:r>
           </w:p>
         </w:tc>
         <w:tc>
@@ -13907,21 +14607,8 @@
                 <w:szCs w:val="28"/>
                 <w:lang w:bidi="ta-IN"/>
               </w:rPr>
-              <w:t xml:space="preserve">47th </w:t>
-            </w:r>
-            <w:proofErr w:type="spellStart"/>
-            <w:r>
-              <w:rPr>
-                <w:rFonts w:cs="Latha"/>
-                <w:b/>
-                <w:bCs/>
-                <w:sz w:val="28"/>
-                <w:szCs w:val="28"/>
-                <w:lang w:bidi="ta-IN"/>
-              </w:rPr>
-              <w:t>Panchaati</w:t>
-            </w:r>
-            <w:proofErr w:type="spellEnd"/>
+              <w:t>47th Panchaati</w:t>
+            </w:r>
           </w:p>
         </w:tc>
         <w:tc>
@@ -14654,51 +15341,35 @@
                 <w:sz w:val="36"/>
                 <w:szCs w:val="36"/>
               </w:rPr>
-              <w:t xml:space="preserve">(lower </w:t>
-            </w:r>
-            <w:proofErr w:type="spellStart"/>
+              <w:t>(lower s</w:t>
+            </w:r>
             <w:r>
               <w:rPr>
                 <w:sz w:val="36"/>
                 <w:szCs w:val="36"/>
               </w:rPr>
-              <w:t>s</w:t>
+              <w:t>w</w:t>
             </w:r>
             <w:r>
               <w:rPr>
                 <w:sz w:val="36"/>
                 <w:szCs w:val="36"/>
               </w:rPr>
-              <w:t>w</w:t>
+              <w:t>a</w:t>
             </w:r>
             <w:r>
               <w:rPr>
                 <w:sz w:val="36"/>
                 <w:szCs w:val="36"/>
               </w:rPr>
-              <w:t>a</w:t>
+              <w:t>r</w:t>
             </w:r>
             <w:r>
               <w:rPr>
                 <w:sz w:val="36"/>
                 <w:szCs w:val="36"/>
               </w:rPr>
-              <w:t>r</w:t>
-            </w:r>
-            <w:r>
-              <w:rPr>
-                <w:sz w:val="36"/>
-                <w:szCs w:val="36"/>
-              </w:rPr>
-              <w:t>am</w:t>
-            </w:r>
-            <w:proofErr w:type="spellEnd"/>
-            <w:r>
-              <w:rPr>
-                <w:sz w:val="36"/>
-                <w:szCs w:val="36"/>
-              </w:rPr>
-              <w:t xml:space="preserve"> deleted)</w:t>
+              <w:t>am deleted)</w:t>
             </w:r>
           </w:p>
         </w:tc>
@@ -14744,20 +15415,8 @@
           <w:szCs w:val="32"/>
           <w:u w:val="single"/>
         </w:rPr>
-        <w:t xml:space="preserve"> Pada </w:t>
+        <w:t xml:space="preserve"> Pada Paatam</w:t>
       </w:r>
-      <w:proofErr w:type="spellStart"/>
-      <w:r>
-        <w:rPr>
-          <w:b/>
-          <w:bCs/>
-          <w:sz w:val="32"/>
-          <w:szCs w:val="32"/>
-          <w:u w:val="single"/>
-        </w:rPr>
-        <w:t>Paatam</w:t>
-      </w:r>
-      <w:proofErr w:type="spellEnd"/>
       <w:r>
         <w:rPr>
           <w:b/>
@@ -15064,31 +15723,7 @@
                 <w:szCs w:val="28"/>
                 <w:lang w:bidi="ta-IN"/>
               </w:rPr>
-              <w:t xml:space="preserve"> </w:t>
-            </w:r>
-            <w:proofErr w:type="spellStart"/>
-            <w:r>
-              <w:rPr>
-                <w:rFonts w:cs="Latha"/>
-                <w:b/>
-                <w:bCs/>
-                <w:sz w:val="28"/>
-                <w:szCs w:val="28"/>
-                <w:lang w:bidi="ta-IN"/>
-              </w:rPr>
-              <w:t>Panchaati</w:t>
-            </w:r>
-            <w:proofErr w:type="spellEnd"/>
-            <w:r>
-              <w:rPr>
-                <w:rFonts w:cs="Latha"/>
-                <w:b/>
-                <w:bCs/>
-                <w:sz w:val="28"/>
-                <w:szCs w:val="28"/>
-                <w:lang w:bidi="ta-IN"/>
-              </w:rPr>
-              <w:t xml:space="preserve"> 32</w:t>
+              <w:t xml:space="preserve"> Panchaati 32</w:t>
             </w:r>
           </w:p>
         </w:tc>
@@ -15499,7 +16134,6 @@
               </w:rPr>
               <w:t xml:space="preserve">5.4.8.2 </w:t>
             </w:r>
-            <w:proofErr w:type="spellStart"/>
             <w:r>
               <w:rPr>
                 <w:rFonts w:cs="Latha"/>
@@ -15509,19 +16143,7 @@
                 <w:szCs w:val="28"/>
                 <w:lang w:bidi="ta-IN"/>
               </w:rPr>
-              <w:t>Panchaati</w:t>
-            </w:r>
-            <w:proofErr w:type="spellEnd"/>
-            <w:r>
-              <w:rPr>
-                <w:rFonts w:cs="Latha"/>
-                <w:b/>
-                <w:bCs/>
-                <w:sz w:val="28"/>
-                <w:szCs w:val="28"/>
-                <w:lang w:bidi="ta-IN"/>
-              </w:rPr>
-              <w:t xml:space="preserve"> 38</w:t>
+              <w:t>Panchaati 38</w:t>
             </w:r>
           </w:p>
           <w:p>
@@ -16614,7 +17236,7 @@
   <w:style w:type="paragraph" w:default="1" w:styleId="Normal">
     <w:name w:val="Normal"/>
     <w:qFormat/>
-    <w:rsid w:val="00076C05"/>
+    <w:rsid w:val="00B10B8B"/>
     <w:pPr>
       <w:spacing w:before="120" w:line="276" w:lineRule="auto"/>
     </w:pPr>

</xml_diff>